<commit_message>
session2: restyled board files, MQTT contract and laptop apps
Six of the seven S2 board files are restyled to the S1 layout and compile
under 5900 B: sf2_01, sf2_02, sf2_03, sf2_05 and the new sf2_06 (smart
gateway) and sf2_07 (field station). Buttons follow the silkscreen:
SW5 is the lower button, SW6 the upper.

MQTT_CONTRACT_th.md is the single description of every topic and
payload, including the field sensor and PLC topics used by the gateway
activity. The fake board, monitor and web app match it and were run
against the public broker. The worksheet gains the gateway extension.

sf2_04 is unchanged here; it is still over the size budget.
</commit_message>
<xml_diff>
--- a/s2/sf-s2-th.docx
+++ b/s2/sf-s2-th.docx
@@ -55,7 +55,7 @@
           <w:b w:val="0"/>
           <w:i w:val="0"/>
         </w:rPr>
-        <w:t xml:space="preserve"> Smart Farm ระยะสั้น (3 คาบ) · </w:t>
+        <w:t xml:space="preserve"> AIoT Development for Smart Farm (Intensive Course) · </w:t>
       </w:r>
       <w:r>
         <w:rPr>
@@ -552,7 +552,7 @@
           <w:i/>
           <w:color w:val="5B616B"/>
         </w:rPr>
-        <w:t xml:space="preserve"> บอกคนรับทุกครั้ง) · ปุ่ม SW4 / SW5 · ลำโพงดังเฉพาะตอนมีเหตุการณ์</w:t>
+        <w:t xml:space="preserve"> บอกคนรับทุกครั้ง) · ปุ่ม SW5 / SW6 · ลำโพงดังเฉพาะตอนมีเหตุการณ์</w:t>
       </w:r>
       <w:r>
         <w:rPr>
@@ -577,7 +577,7 @@
           <w:i/>
           <w:color w:val="5B616B"/>
         </w:rPr>
-        <w:t xml:space="preserve"> SW4 = </w:t>
+        <w:t xml:space="preserve"> SW5 = ปุ่มล่าง = </w:t>
       </w:r>
       <w:r>
         <w:rPr>
@@ -587,7 +587,7 @@
           <w:color w:val="5B616B"/>
           <w:sz w:val="21"/>
         </w:rPr>
-        <w:t>buttons</w:t>
+        <w:t>buttons.pressed(0)</w:t>
       </w:r>
       <w:r>
         <w:rPr>
@@ -596,7 +596,7 @@
           <w:i/>
           <w:color w:val="5B616B"/>
         </w:rPr>
-        <w:t xml:space="preserve"> ลำดับ 0 (ขา P17.5) · SW5 = ลำดับ 1 (ขา P17.7) · หน้า "GPIO &amp; RGB Matrix" บนจอบอร์ดเรียกสองปุ่มเดียวกันนี้ว่า SW5/SW6 ถ้าสงสัยให้ถาม </w:t>
+        <w:t xml:space="preserve"> (ขา P17.5) · SW6 = ปุ่มบน = </w:t>
       </w:r>
       <w:r>
         <w:rPr>
@@ -606,7 +606,45 @@
           <w:color w:val="5B616B"/>
           <w:sz w:val="21"/>
         </w:rPr>
-        <w:t>buttons.name(0)</w:t>
+        <w:t>buttons.pressed(1)</w:t>
+      </w:r>
+      <w:r>
+        <w:rPr>
+          <w:rFonts w:ascii="TH Sarabun New" w:hAnsi="TH Sarabun New" w:cs="TH Sarabun New" w:eastAsia="TH Sarabun New"/>
+          <w:b w:val="0"/>
+          <w:i/>
+          <w:color w:val="5B616B"/>
+        </w:rPr>
+        <w:t xml:space="preserve"> (ขา P17.7) · อย่าเชื่อ </w:t>
+      </w:r>
+      <w:r>
+        <w:rPr>
+          <w:rFonts w:ascii="Consolas" w:hAnsi="Consolas" w:cs="Consolas" w:eastAsia="Consolas"/>
+          <w:b w:val="0"/>
+          <w:i/>
+          <w:color w:val="5B616B"/>
+          <w:sz w:val="21"/>
+        </w:rPr>
+        <w:t>buttons.name()</w:t>
+      </w:r>
+      <w:r>
+        <w:rPr>
+          <w:rFonts w:ascii="TH Sarabun New" w:hAnsi="TH Sarabun New" w:cs="TH Sarabun New" w:eastAsia="TH Sarabun New"/>
+          <w:b w:val="0"/>
+          <w:i/>
+          <w:color w:val="5B616B"/>
+        </w:rPr>
+        <w:t xml:space="preserve"> (เฟิร์มแวร์ตั้งชื่อไว้ผิด) ไฟล์ของคาบนี้จึงเขียนชื่อปุ่มไว้เองใน </w:t>
+      </w:r>
+      <w:r>
+        <w:rPr>
+          <w:rFonts w:ascii="Consolas" w:hAnsi="Consolas" w:cs="Consolas" w:eastAsia="Consolas"/>
+          <w:b w:val="0"/>
+          <w:i/>
+          <w:color w:val="5B616B"/>
+          <w:sz w:val="21"/>
+        </w:rPr>
+        <w:t>BTN_NAMES</w:t>
       </w:r>
       <w:r>
         <w:rPr>
@@ -2205,6 +2243,67 @@
           <w:b w:val="0"/>
           <w:i w:val="0"/>
         </w:rPr>
+        <w:t xml:space="preserve">ต่อยอดสำหรับกลุ่มที่เสร็จเร็วและโปรเจกต์: </w:t>
+      </w:r>
+      <w:r>
+        <w:rPr>
+          <w:rFonts w:ascii="Consolas" w:hAnsi="Consolas" w:cs="Consolas" w:eastAsia="Consolas"/>
+          <w:b w:val="0"/>
+          <w:i w:val="0"/>
+          <w:sz w:val="21"/>
+        </w:rPr>
+        <w:t>sf2_06_smart_gateway.py</w:t>
+      </w:r>
+      <w:r>
+        <w:rPr>
+          <w:rFonts w:ascii="TH Sarabun New" w:hAnsi="TH Sarabun New" w:cs="TH Sarabun New" w:eastAsia="TH Sarabun New"/>
+          <w:b w:val="0"/>
+          <w:i w:val="0"/>
+        </w:rPr>
+        <w:t xml:space="preserve"> + </w:t>
+      </w:r>
+      <w:r>
+        <w:rPr>
+          <w:rFonts w:ascii="Consolas" w:hAnsi="Consolas" w:cs="Consolas" w:eastAsia="Consolas"/>
+          <w:b w:val="0"/>
+          <w:i w:val="0"/>
+          <w:sz w:val="21"/>
+        </w:rPr>
+        <w:t>app/field_sim.py</w:t>
+      </w:r>
+      <w:r>
+        <w:rPr>
+          <w:rFonts w:ascii="TH Sarabun New" w:hAnsi="TH Sarabun New" w:cs="TH Sarabun New" w:eastAsia="TH Sarabun New"/>
+          <w:b w:val="0"/>
+          <w:i w:val="0"/>
+        </w:rPr>
+        <w:t xml:space="preserve"> หรือจับคู่กับอีกกลุ่มด้วย </w:t>
+      </w:r>
+      <w:r>
+        <w:rPr>
+          <w:rFonts w:ascii="Consolas" w:hAnsi="Consolas" w:cs="Consolas" w:eastAsia="Consolas"/>
+          <w:b w:val="0"/>
+          <w:i w:val="0"/>
+          <w:sz w:val="21"/>
+        </w:rPr>
+        <w:t>sf2_07_field_station.py</w:t>
+      </w:r>
+      <w:r>
+        <w:rPr>
+          <w:rFonts w:ascii="TH Sarabun New" w:hAnsi="TH Sarabun New" w:cs="TH Sarabun New" w:eastAsia="TH Sarabun New"/>
+          <w:b w:val="0"/>
+          <w:i w:val="0"/>
+        </w:rPr>
+        <w:t xml:space="preserve"> (ข้อ 4.6)</w:t>
+      </w:r>
+    </w:p>
+    <w:p>
+      <w:r>
+        <w:rPr>
+          <w:rFonts w:ascii="TH Sarabun New" w:hAnsi="TH Sarabun New" w:cs="TH Sarabun New" w:eastAsia="TH Sarabun New"/>
+          <w:b w:val="0"/>
+          <w:i w:val="0"/>
+        </w:rPr>
         <w:t xml:space="preserve">อ่านนอกเวลา (ไม่บังคับ): </w:t>
       </w:r>
       <w:r>
@@ -2246,7 +2345,7 @@
           <w:b/>
           <w:i w:val="0"/>
         </w:rPr>
-        <w:t>บอร์ดต่อ Hotspot มือถือของกลุ่ม ไม่ใช่ WiFi ของคณะ</w:t>
+        <w:t>บอร์ดต่อ Hotspot มือถือของกลุ่ม ไม่ใช่ WiFi ของสถานที่</w:t>
       </w:r>
       <w:r>
         <w:rPr>
@@ -2254,7 +2353,7 @@
           <w:b w:val="0"/>
           <w:i w:val="0"/>
         </w:rPr>
-        <w:t xml:space="preserve"> WiFi คณะต้อง login ผ่านหน้าเว็บ (captive portal) บอร์ดกดไม่ได้ จะได้ IP แต่ออกเน็ตไม่ได้ · ให้กลุ่มตั้งชื่อวงเป็นอักษรอังกฤษสั้น ๆ เช่น </w:t>
+        <w:t xml:space="preserve"> WiFi ที่ต้อง login ผ่านหน้าเว็บ (captive portal) บอร์ดกดไม่ได้ จะได้ IP แต่ออกเน็ตไม่ได้ · ให้กลุ่มตั้งชื่อวงเป็นอักษรอังกฤษสั้น ๆ เช่น </w:t>
       </w:r>
       <w:r>
         <w:rPr>
@@ -2484,7 +2583,7 @@
           <w:b w:val="0"/>
           <w:i w:val="0"/>
         </w:rPr>
-        <w:t xml:space="preserve"> แล้วเปิดหน้ารวมของคอร์สแม่ &lt;https://advance-innovation-centre-aic.github.io/embedded-systems-for-aiot-developer/examples/web/mqtt_dashboard.html&gt; บนเน็ตมหาวิทยาลัย การ์ดขึ้น = ผ่าน · ไม่ขึ้น = ให้โน้ตบุ๊กเกาะ Hotspot เดียวกับบอร์ด</w:t>
+        <w:t xml:space="preserve"> แล้วเปิดหน้ารวม MQTT &lt;https://advance-innovation-centre-aic.github.io/embedded-systems-for-aiot-developer/examples/web/mqtt_dashboard.html&gt; บนเน็ตมหาวิทยาลัย การ์ดขึ้น = ผ่าน · ไม่ขึ้น = ให้โน้ตบุ๊กเกาะ Hotspot เดียวกับบอร์ด</w:t>
       </w:r>
     </w:p>
     <w:p>
@@ -2633,7 +2732,24 @@
           <w:b/>
           <w:i w:val="0"/>
         </w:rPr>
-        <w:t>ถ้าคอร์สแม่ (AIoT) เรียนพร้อมกันบน broker เดียวกัน</w:t>
+        <w:t xml:space="preserve">ถ้ามีคลาสอื่นใช้หัวข้อ </w:t>
+      </w:r>
+      <w:r>
+        <w:rPr>
+          <w:rFonts w:ascii="Consolas" w:hAnsi="Consolas" w:cs="Consolas" w:eastAsia="Consolas"/>
+          <w:b/>
+          <w:i w:val="0"/>
+          <w:sz w:val="21"/>
+        </w:rPr>
+        <w:t>bento-aiot</w:t>
+      </w:r>
+      <w:r>
+        <w:rPr>
+          <w:rFonts w:ascii="TH Sarabun New" w:hAnsi="TH Sarabun New" w:cs="TH Sarabun New" w:eastAsia="TH Sarabun New"/>
+          <w:b/>
+          <w:i w:val="0"/>
+        </w:rPr>
+        <w:t xml:space="preserve"> บน broker เดียวกันพร้อมกัน</w:t>
       </w:r>
       <w:r>
         <w:rPr>
@@ -2879,7 +2995,7 @@
           <w:b w:val="0"/>
           <w:i w:val="0"/>
         </w:rPr>
-        <w:t xml:space="preserve"> ของคอร์สแม่ (ROOT = </w:t>
+        <w:t xml:space="preserve"> (ROOT = </w:t>
       </w:r>
       <w:r>
         <w:rPr>
@@ -3042,7 +3158,7 @@
           <w:b w:val="0"/>
           <w:i w:val="0"/>
         </w:rPr>
-        <w:t xml:space="preserve"> 20 บอร์ดดังพร้อมกันหนวกหู </w:t>
+        <w:t xml:space="preserve"> บอร์ดทั้งห้องดังพร้อมกันหนวกหู </w:t>
       </w:r>
       <w:r>
         <w:rPr>
@@ -3076,7 +3192,7 @@
           <w:b w:val="0"/>
           <w:i w:val="0"/>
         </w:rPr>
-        <w:t xml:space="preserve"> (ดังเฉพาะตอนกด SW4) ประกาศใช้ถ้าห้องเสียงดังเกิน</w:t>
+        <w:t xml:space="preserve"> (ดังเฉพาะตอนกด SW5) ประกาศใช้ถ้าห้องเสียงดังเกิน</w:t>
       </w:r>
     </w:p>
     <w:p>
@@ -3516,7 +3632,7 @@
                 <w:b w:val="0"/>
                 <w:i w:val="0"/>
               </w:rPr>
-              <w:t xml:space="preserve"> บอร์ด + ปุ่ม SW4</w:t>
+              <w:t xml:space="preserve"> บอร์ด + ปุ่ม SW5</w:t>
             </w:r>
           </w:p>
         </w:tc>
@@ -3759,7 +3875,7 @@
                 <w:b w:val="0"/>
                 <w:i w:val="0"/>
               </w:rPr>
-              <w:t xml:space="preserve"> — จอนิ่ง แต่จอ LED วิ่ง WIFI · ได้ IP · เฝ้าลิงก์ 1 นาที</w:t>
+              <w:t xml:space="preserve"> — จอนิ่ง แต่จอ LED วิ่ง WIFI · ได้ IP · เฝ้าลิงก์ 1 นาที (วงแหวน % ออนไลน์ + กราฟ)</w:t>
             </w:r>
           </w:p>
         </w:tc>
@@ -3853,7 +3969,7 @@
                 <w:b w:val="0"/>
                 <w:i w:val="0"/>
               </w:rPr>
-              <w:t xml:space="preserve"> — 4 การ์ด + กราฟสองเส้น · มือถือเห็นกล่องค่า · SW4 ส่งทันที · SW5 ส่งเหตุการณ์</w:t>
+              <w:t xml:space="preserve"> — ตัวเลขใหญ่ 3 ช่อง + กราฟบอร์ด/คลาวด์ · มือถือเห็นการ์ดค่า · SW5 ส่งทันที · SW6 ส่งเหตุการณ์</w:t>
             </w:r>
           </w:p>
         </w:tc>
@@ -4059,7 +4175,7 @@
                 <w:b w:val="0"/>
                 <w:i w:val="0"/>
               </w:rPr>
-              <w:t xml:space="preserve"> — ปั๊มเปิด/ปิดจากที่ไกล · จอ LED นับถอยหลัง · SW4 หยุดฉุกเฉิน</w:t>
+              <w:t xml:space="preserve"> — ปั๊ม (ไฟสีฟ้าบนบอร์ด) เปิด/ปิดจากที่ไกล · วงแหวนและจอ LED นับถอยหลัง · SW5 หยุดฉุกเฉิน</w:t>
             </w:r>
           </w:p>
         </w:tc>
@@ -4154,7 +4270,7 @@
                 <w:b w:val="0"/>
                 <w:i w:val="0"/>
               </w:rPr>
-              <w:t xml:space="preserve"> — แจ้งเตือนเมื่อสถานะเปลี่ยน · รับทราบจากมือถือหรือ SW4 · ตั้งเกณฑ์จากที่ไกล</w:t>
+              <w:t xml:space="preserve"> — แจ้งเตือนเมื่อสถานะเปลี่ยน · รับทราบจากมือถือหรือ SW5 · ตั้งเกณฑ์จากที่ไกล</w:t>
             </w:r>
           </w:p>
         </w:tc>
@@ -4249,6 +4365,212 @@
                 <w:i w:val="0"/>
               </w:rPr>
               <w:t xml:space="preserve"> (ไม่บังคับ) — อ่านคลังค่าตั้งบนแฟลช</w:t>
+            </w:r>
+          </w:p>
+        </w:tc>
+        <w:tc>
+          <w:tcPr>
+            <w:tcW w:type="dxa" w:w="3249"/>
+            <w:tcMar>
+              <w:top w:w="40" w:type="dxa"/>
+              <w:bottom w:w="40" w:type="dxa"/>
+              <w:start w:w="90" w:type="dxa"/>
+              <w:end w:w="90" w:type="dxa"/>
+            </w:tcMar>
+            <w:shd w:val="clear" w:fill="F4F7FB"/>
+          </w:tcPr>
+          <w:p>
+            <w:pPr>
+              <w:spacing w:after="40" w:before="40" w:line="252" w:lineRule="auto"/>
+            </w:pPr>
+            <w:r>
+              <w:rPr>
+                <w:rFonts w:ascii="TH Sarabun New" w:hAnsi="TH Sarabun New" w:cs="TH Sarabun New" w:eastAsia="TH Sarabun New"/>
+              </w:rPr>
+            </w:r>
+            <w:r>
+              <w:rPr>
+                <w:rFonts w:ascii="TH Sarabun New" w:hAnsi="TH Sarabun New" w:cs="TH Sarabun New" w:eastAsia="TH Sarabun New"/>
+                <w:b w:val="0"/>
+                <w:i w:val="0"/>
+              </w:rPr>
+              <w:t>☐</w:t>
+            </w:r>
+          </w:p>
+        </w:tc>
+        <w:tc>
+          <w:tcPr>
+            <w:tcW w:type="dxa" w:w="3249"/>
+            <w:tcMar>
+              <w:top w:w="40" w:type="dxa"/>
+              <w:bottom w:w="40" w:type="dxa"/>
+              <w:start w:w="90" w:type="dxa"/>
+              <w:end w:w="90" w:type="dxa"/>
+            </w:tcMar>
+            <w:shd w:val="clear" w:fill="F4F7FB"/>
+          </w:tcPr>
+          <w:p>
+            <w:pPr>
+              <w:spacing w:after="40" w:before="40" w:line="252" w:lineRule="auto"/>
+            </w:pPr>
+            <w:r>
+              <w:rPr>
+                <w:rFonts w:ascii="TH Sarabun New" w:hAnsi="TH Sarabun New" w:cs="TH Sarabun New" w:eastAsia="TH Sarabun New"/>
+              </w:rPr>
+            </w:r>
+          </w:p>
+        </w:tc>
+      </w:tr>
+      <w:tr>
+        <w:trPr>
+          <w:cantSplit w:val="true"/>
+        </w:trPr>
+        <w:tc>
+          <w:tcPr>
+            <w:tcW w:type="dxa" w:w="3249"/>
+            <w:tcMar>
+              <w:top w:w="40" w:type="dxa"/>
+              <w:bottom w:w="40" w:type="dxa"/>
+              <w:start w:w="90" w:type="dxa"/>
+              <w:end w:w="90" w:type="dxa"/>
+            </w:tcMar>
+          </w:tcPr>
+          <w:p>
+            <w:pPr>
+              <w:spacing w:after="40" w:before="40" w:line="252" w:lineRule="auto"/>
+            </w:pPr>
+            <w:r>
+              <w:rPr>
+                <w:rFonts w:ascii="TH Sarabun New" w:hAnsi="TH Sarabun New" w:cs="TH Sarabun New" w:eastAsia="TH Sarabun New"/>
+              </w:rPr>
+            </w:r>
+            <w:r>
+              <w:rPr>
+                <w:rFonts w:ascii="Consolas" w:hAnsi="Consolas" w:cs="Consolas" w:eastAsia="Consolas"/>
+                <w:b w:val="0"/>
+                <w:i w:val="0"/>
+                <w:sz w:val="21"/>
+              </w:rPr>
+              <w:t>sf2_06_smart_gateway.py</w:t>
+            </w:r>
+            <w:r>
+              <w:rPr>
+                <w:rFonts w:ascii="TH Sarabun New" w:hAnsi="TH Sarabun New" w:cs="TH Sarabun New" w:eastAsia="TH Sarabun New"/>
+                <w:b w:val="0"/>
+                <w:i w:val="0"/>
+              </w:rPr>
+              <w:t xml:space="preserve"> + </w:t>
+            </w:r>
+            <w:r>
+              <w:rPr>
+                <w:rFonts w:ascii="Consolas" w:hAnsi="Consolas" w:cs="Consolas" w:eastAsia="Consolas"/>
+                <w:b w:val="0"/>
+                <w:i w:val="0"/>
+                <w:sz w:val="21"/>
+              </w:rPr>
+              <w:t>app/field_sim.py</w:t>
+            </w:r>
+            <w:r>
+              <w:rPr>
+                <w:rFonts w:ascii="TH Sarabun New" w:hAnsi="TH Sarabun New" w:cs="TH Sarabun New" w:eastAsia="TH Sarabun New"/>
+                <w:b w:val="0"/>
+                <w:i w:val="0"/>
+              </w:rPr>
+              <w:t xml:space="preserve"> (ต่อยอด) — บอร์ดเป็น Smart IoT Gateway สั่ง PLC รดน้ำเอง</w:t>
+            </w:r>
+          </w:p>
+        </w:tc>
+        <w:tc>
+          <w:tcPr>
+            <w:tcW w:type="dxa" w:w="3249"/>
+            <w:tcMar>
+              <w:top w:w="40" w:type="dxa"/>
+              <w:bottom w:w="40" w:type="dxa"/>
+              <w:start w:w="90" w:type="dxa"/>
+              <w:end w:w="90" w:type="dxa"/>
+            </w:tcMar>
+          </w:tcPr>
+          <w:p>
+            <w:pPr>
+              <w:spacing w:after="40" w:before="40" w:line="252" w:lineRule="auto"/>
+            </w:pPr>
+            <w:r>
+              <w:rPr>
+                <w:rFonts w:ascii="TH Sarabun New" w:hAnsi="TH Sarabun New" w:cs="TH Sarabun New" w:eastAsia="TH Sarabun New"/>
+              </w:rPr>
+            </w:r>
+            <w:r>
+              <w:rPr>
+                <w:rFonts w:ascii="TH Sarabun New" w:hAnsi="TH Sarabun New" w:cs="TH Sarabun New" w:eastAsia="TH Sarabun New"/>
+                <w:b w:val="0"/>
+                <w:i w:val="0"/>
+              </w:rPr>
+              <w:t>☐</w:t>
+            </w:r>
+          </w:p>
+        </w:tc>
+        <w:tc>
+          <w:tcPr>
+            <w:tcW w:type="dxa" w:w="3249"/>
+            <w:tcMar>
+              <w:top w:w="40" w:type="dxa"/>
+              <w:bottom w:w="40" w:type="dxa"/>
+              <w:start w:w="90" w:type="dxa"/>
+              <w:end w:w="90" w:type="dxa"/>
+            </w:tcMar>
+          </w:tcPr>
+          <w:p>
+            <w:pPr>
+              <w:spacing w:after="40" w:before="40" w:line="252" w:lineRule="auto"/>
+            </w:pPr>
+            <w:r>
+              <w:rPr>
+                <w:rFonts w:ascii="TH Sarabun New" w:hAnsi="TH Sarabun New" w:cs="TH Sarabun New" w:eastAsia="TH Sarabun New"/>
+              </w:rPr>
+            </w:r>
+          </w:p>
+        </w:tc>
+      </w:tr>
+      <w:tr>
+        <w:trPr>
+          <w:cantSplit w:val="true"/>
+        </w:trPr>
+        <w:tc>
+          <w:tcPr>
+            <w:tcW w:type="dxa" w:w="3249"/>
+            <w:tcMar>
+              <w:top w:w="40" w:type="dxa"/>
+              <w:bottom w:w="40" w:type="dxa"/>
+              <w:start w:w="90" w:type="dxa"/>
+              <w:end w:w="90" w:type="dxa"/>
+            </w:tcMar>
+            <w:shd w:val="clear" w:fill="F4F7FB"/>
+          </w:tcPr>
+          <w:p>
+            <w:pPr>
+              <w:spacing w:after="40" w:before="40" w:line="252" w:lineRule="auto"/>
+            </w:pPr>
+            <w:r>
+              <w:rPr>
+                <w:rFonts w:ascii="TH Sarabun New" w:hAnsi="TH Sarabun New" w:cs="TH Sarabun New" w:eastAsia="TH Sarabun New"/>
+              </w:rPr>
+            </w:r>
+            <w:r>
+              <w:rPr>
+                <w:rFonts w:ascii="Consolas" w:hAnsi="Consolas" w:cs="Consolas" w:eastAsia="Consolas"/>
+                <w:b w:val="0"/>
+                <w:i w:val="0"/>
+                <w:sz w:val="21"/>
+              </w:rPr>
+              <w:t>sf2_07_field_station.py</w:t>
+            </w:r>
+            <w:r>
+              <w:rPr>
+                <w:rFonts w:ascii="TH Sarabun New" w:hAnsi="TH Sarabun New" w:cs="TH Sarabun New" w:eastAsia="TH Sarabun New"/>
+                <w:b w:val="0"/>
+                <w:i w:val="0"/>
+              </w:rPr>
+              <w:t xml:space="preserve"> (จับคู่กลุ่ม) — บอร์ดเพื่อนเล่นเป็นแปลง: โหนดเซนเซอร์ + PLC</w:t>
             </w:r>
           </w:p>
         </w:tc>
@@ -5971,7 +6293,7 @@
           <w:b w:val="0"/>
           <w:i w:val="0"/>
         </w:rPr>
-        <w:t xml:space="preserve">☐ กด SW4 แล้วมือถือได้ใบที่ </w:t>
+        <w:t xml:space="preserve">☐ กด SW5 แล้วมือถือได้ใบที่ </w:t>
       </w:r>
       <w:r>
         <w:rPr>
@@ -5980,7 +6302,7 @@
           <w:i w:val="0"/>
           <w:sz w:val="21"/>
         </w:rPr>
-        <w:t>by = sw4</w:t>
+        <w:t>by = sw5</w:t>
       </w:r>
       <w:r>
         <w:rPr>
@@ -5988,7 +6310,7 @@
           <w:b w:val="0"/>
           <w:i w:val="0"/>
         </w:rPr>
-        <w:t xml:space="preserve"> ทันที · ☐ กด SW5 แล้วกล่อง "เหตุการณ์ล่าสุด" ขึ้น </w:t>
+        <w:t xml:space="preserve"> ทันที · ☐ กด SW6 แล้วกล่อง "เหตุการณ์ล่าสุด" ขึ้น </w:t>
       </w:r>
       <w:r>
         <w:rPr>
@@ -5997,7 +6319,7 @@
           <w:i w:val="0"/>
           <w:sz w:val="21"/>
         </w:rPr>
-        <w:t>"event": "sw5"</w:t>
+        <w:t>"event": "sw6"</w:t>
       </w:r>
       <w:r>
         <w:rPr>
@@ -6156,7 +6478,7 @@
           <w:b w:val="0"/>
           <w:i w:val="0"/>
         </w:rPr>
-        <w:t xml:space="preserve"> · ☐ ตารางสดขึ้นทุก 5 วินาที · ☐ กด SW5 บนบอร์ดแล้วแอปขึ้น </w:t>
+        <w:t xml:space="preserve"> · ☐ ตารางสดขึ้นทุก 5 วินาที · ☐ กด SW6 บนบอร์ดแล้วแอปขึ้น </w:t>
       </w:r>
       <w:r>
         <w:rPr>
@@ -6953,7 +7275,7 @@
                 <w:i w:val="0"/>
                 <w:color w:val="FFFFFF"/>
               </w:rPr>
-              <w:t>ปั๊ม (LED)</w:t>
+              <w:t>ปั๊ม (ไฟสีฟ้า)</w:t>
             </w:r>
           </w:p>
         </w:tc>
@@ -7908,7 +8230,7 @@
           <w:b w:val="0"/>
           <w:i w:val="0"/>
         </w:rPr>
-        <w:t xml:space="preserve">☐ ระหว่างปั๊มเปิด กด SW4 แล้วปั๊มดับทันที แม้ปิด Hotspot อยู่ · แอป </w:t>
+        <w:t xml:space="preserve">☐ ระหว่างปั๊มเปิด กด SW5 แล้วปั๊มดับทันที แม้ปิด Hotspot อยู่ · แอป </w:t>
       </w:r>
       <w:r>
         <w:rPr>
@@ -8023,7 +8345,7 @@
           <w:b w:val="0"/>
           <w:i w:val="0"/>
         </w:rPr>
-        <w:t xml:space="preserve"> จากหน้ารวม · ☐ รับทราบด้วย SW4 · ☐ ส่ง </w:t>
+        <w:t xml:space="preserve"> จากหน้ารวม · ☐ รับทราบด้วย SW5 · ☐ ส่ง </w:t>
       </w:r>
       <w:r>
         <w:rPr>
@@ -8593,6 +8915,586 @@
     </w:p>
     <w:p>
       <w:pPr>
+        <w:pStyle w:val="Heading3"/>
+      </w:pPr>
+      <w:r>
+        <w:rPr>
+          <w:rFonts w:ascii="TH Sarabun New" w:hAnsi="TH Sarabun New" w:cs="TH Sarabun New" w:eastAsia="TH Sarabun New"/>
+          <w:b/>
+          <w:i w:val="0"/>
+          <w:color w:val="2E5496"/>
+        </w:rPr>
+        <w:t>4.6 ต่อยอด — บอร์ดของเราคือ Smart IoT Gateway (</w:t>
+      </w:r>
+      <w:r>
+        <w:rPr>
+          <w:rFonts w:ascii="TH Sarabun New" w:hAnsi="TH Sarabun New" w:cs="TH Sarabun New" w:eastAsia="TH Sarabun New"/>
+          <w:b/>
+          <w:i w:val="0"/>
+          <w:color w:val="2E5496"/>
+          <w:sz w:val="21"/>
+        </w:rPr>
+        <w:t>sf2_06_smart_gateway.py</w:t>
+      </w:r>
+      <w:r>
+        <w:rPr>
+          <w:rFonts w:ascii="TH Sarabun New" w:hAnsi="TH Sarabun New" w:cs="TH Sarabun New" w:eastAsia="TH Sarabun New"/>
+          <w:b/>
+          <w:i w:val="0"/>
+          <w:color w:val="2E5496"/>
+        </w:rPr>
+        <w:t>)</w:t>
+      </w:r>
+    </w:p>
+    <w:p>
+      <w:r>
+        <w:rPr>
+          <w:rFonts w:ascii="TH Sarabun New" w:hAnsi="TH Sarabun New" w:cs="TH Sarabun New" w:eastAsia="TH Sarabun New"/>
+          <w:b w:val="0"/>
+          <w:i w:val="0"/>
+        </w:rPr>
+        <w:t>ฟาร์มจริงไม่ได้ต่อสายเซนเซอร์เข้าบอร์ดตรง ๆ: กลางแปลงมี</w:t>
+      </w:r>
+      <w:r>
+        <w:rPr>
+          <w:rFonts w:ascii="TH Sarabun New" w:hAnsi="TH Sarabun New" w:cs="TH Sarabun New" w:eastAsia="TH Sarabun New"/>
+          <w:b/>
+          <w:i w:val="0"/>
+        </w:rPr>
+        <w:t>โหนดเซนเซอร์ไร้สาย</w:t>
+      </w:r>
+      <w:r>
+        <w:rPr>
+          <w:rFonts w:ascii="TH Sarabun New" w:hAnsi="TH Sarabun New" w:cs="TH Sarabun New" w:eastAsia="TH Sarabun New"/>
+          <w:b w:val="0"/>
+          <w:i w:val="0"/>
+        </w:rPr>
+        <w:t xml:space="preserve">ส่งค่าขึ้น MQTT และที่โรงสูบมี </w:t>
+      </w:r>
+      <w:r>
+        <w:rPr>
+          <w:rFonts w:ascii="TH Sarabun New" w:hAnsi="TH Sarabun New" w:cs="TH Sarabun New" w:eastAsia="TH Sarabun New"/>
+          <w:b/>
+          <w:i w:val="0"/>
+        </w:rPr>
+        <w:t>PLC WiFi</w:t>
+      </w:r>
+      <w:r>
+        <w:rPr>
+          <w:rFonts w:ascii="TH Sarabun New" w:hAnsi="TH Sarabun New" w:cs="TH Sarabun New" w:eastAsia="TH Sarabun New"/>
+          <w:b w:val="0"/>
+          <w:i w:val="0"/>
+        </w:rPr>
+        <w:t xml:space="preserve"> คุมรีเลย์ปั๊ม บอร์ดของเราเป็น </w:t>
+      </w:r>
+      <w:r>
+        <w:rPr>
+          <w:rFonts w:ascii="TH Sarabun New" w:hAnsi="TH Sarabun New" w:cs="TH Sarabun New" w:eastAsia="TH Sarabun New"/>
+          <w:b/>
+          <w:i w:val="0"/>
+        </w:rPr>
+        <w:t>Smart IoT Gateway</w:t>
+      </w:r>
+      <w:r>
+        <w:rPr>
+          <w:rFonts w:ascii="TH Sarabun New" w:hAnsi="TH Sarabun New" w:cs="TH Sarabun New" w:eastAsia="TH Sarabun New"/>
+          <w:b w:val="0"/>
+          <w:i w:val="0"/>
+        </w:rPr>
+        <w:t xml:space="preserve"> อยู่ตรงกลาง: อ่านค่าทุกโหนด ตัดสินใจ สั่ง PLC แล้วโชว์ทุกอย่างบนจอ ส่วนแอปของกลุ่มดูได้ทุกหัวข้อ</w:t>
+      </w:r>
+    </w:p>
+    <w:tbl>
+      <w:tblPr>
+        <w:tblW w:type="auto" w:w="0"/>
+        <w:tblLook w:firstColumn="1" w:firstRow="1" w:lastColumn="0" w:lastRow="0" w:noHBand="0" w:noVBand="1" w:val="04A0"/>
+        <w:tblW w:type="pct" w:w="5000"/>
+        <w:tblBorders>
+          <w:top w:val="single" w:sz="4" w:space="0" w:color="C7D2E4"/>
+          <w:left w:val="single" w:sz="4" w:space="0" w:color="C7D2E4"/>
+          <w:bottom w:val="single" w:sz="4" w:space="0" w:color="C7D2E4"/>
+          <w:right w:val="single" w:sz="4" w:space="0" w:color="C7D2E4"/>
+          <w:insideH w:val="single" w:sz="4" w:space="0" w:color="C7D2E4"/>
+          <w:insideV w:val="single" w:sz="4" w:space="0" w:color="C7D2E4"/>
+        </w:tblBorders>
+      </w:tblPr>
+      <w:tblGrid>
+        <w:gridCol w:w="9746"/>
+      </w:tblGrid>
+      <w:tr>
+        <w:tc>
+          <w:tcPr>
+            <w:tcW w:type="dxa" w:w="9746"/>
+            <w:shd w:val="clear" w:fill="F6F8FA"/>
+            <w:tcMar>
+              <w:top w:w="80" w:type="dxa"/>
+              <w:bottom w:w="80" w:type="dxa"/>
+              <w:start w:w="140" w:type="dxa"/>
+              <w:end w:w="140" w:type="dxa"/>
+            </w:tcMar>
+          </w:tcPr>
+          <w:p>
+            <w:pPr>
+              <w:spacing w:after="0" w:before="0" w:line="240" w:lineRule="auto"/>
+            </w:pPr>
+            <w:r>
+              <w:rPr>
+                <w:rFonts w:ascii="TH Sarabun New" w:hAnsi="TH Sarabun New" w:cs="TH Sarabun New" w:eastAsia="TH Sarabun New"/>
+              </w:rPr>
+            </w:r>
+            <w:r>
+              <w:rPr>
+                <w:rFonts w:ascii="Consolas" w:hAnsi="Consolas" w:cs="Consolas" w:eastAsia="Consolas"/>
+                <w:color w:val="222529"/>
+                <w:sz w:val="21"/>
+              </w:rPr>
+              <w:t xml:space="preserve"> [โหนดเซนเซอร์ไร้สาย] --field/soil, field/tank--&gt; [broker] --&gt; [Dev Kit = Smart IoT Gateway: ตัดสินใจ + จอ + เสียง]</w:t>
+            </w:r>
+          </w:p>
+          <w:p>
+            <w:pPr>
+              <w:spacing w:after="0" w:before="0" w:line="240" w:lineRule="auto"/>
+            </w:pPr>
+            <w:r>
+              <w:rPr>
+                <w:rFonts w:ascii="Consolas" w:hAnsi="Consolas" w:cs="Consolas" w:eastAsia="Consolas"/>
+                <w:color w:val="222529"/>
+                <w:sz w:val="21"/>
+              </w:rPr>
+              <w:t xml:space="preserve">                                                              &lt;-- plc/cmd --</w:t>
+            </w:r>
+          </w:p>
+          <w:p>
+            <w:pPr>
+              <w:spacing w:after="0" w:before="0" w:line="240" w:lineRule="auto"/>
+            </w:pPr>
+            <w:r>
+              <w:rPr>
+                <w:rFonts w:ascii="Consolas" w:hAnsi="Consolas" w:cs="Consolas" w:eastAsia="Consolas"/>
+                <w:color w:val="222529"/>
+                <w:sz w:val="21"/>
+              </w:rPr>
+              <w:t xml:space="preserve"> [PLC WiFi -&gt; ปั๊ม]   &lt;--plc/cmd-- [broker] --plc/state--&gt; [Gateway]      [แอปของกลุ่ม: ดูทุกหัวข้อ #]</w:t>
+            </w:r>
+          </w:p>
+          <w:p>
+            <w:pPr>
+              <w:spacing w:after="0" w:before="0" w:line="240" w:lineRule="auto"/>
+            </w:pPr>
+            <w:r>
+              <w:rPr>
+                <w:rFonts w:ascii="Consolas" w:hAnsi="Consolas" w:cs="Consolas" w:eastAsia="Consolas"/>
+                <w:color w:val="222529"/>
+                <w:sz w:val="21"/>
+              </w:rPr>
+            </w:r>
+          </w:p>
+          <w:p>
+            <w:pPr>
+              <w:spacing w:after="0" w:before="0" w:line="240" w:lineRule="auto"/>
+            </w:pPr>
+            <w:r>
+              <w:rPr>
+                <w:rFonts w:ascii="Consolas" w:hAnsi="Consolas" w:cs="Consolas" w:eastAsia="Consolas"/>
+                <w:color w:val="222529"/>
+                <w:sz w:val="21"/>
+              </w:rPr>
+            </w:r>
+          </w:p>
+          <w:p>
+            <w:pPr>
+              <w:spacing w:after="0" w:before="0" w:line="240" w:lineRule="auto"/>
+            </w:pPr>
+            <w:r>
+              <w:rPr>
+                <w:rFonts w:ascii="Consolas" w:hAnsi="Consolas" w:cs="Consolas" w:eastAsia="Consolas"/>
+                <w:color w:val="222529"/>
+                <w:sz w:val="21"/>
+              </w:rPr>
+            </w:r>
+          </w:p>
+        </w:tc>
+      </w:tr>
+    </w:tbl>
+    <w:p>
+      <w:pPr>
+        <w:spacing w:after="40"/>
+      </w:pPr>
+    </w:p>
+    <w:p>
+      <w:r>
+        <w:rPr>
+          <w:rFonts w:ascii="TH Sarabun New" w:hAnsi="TH Sarabun New" w:cs="TH Sarabun New" w:eastAsia="TH Sarabun New"/>
+          <w:b w:val="0"/>
+          <w:i w:val="0"/>
+        </w:rPr>
+        <w:t xml:space="preserve">ในห้องเรียนไม่มีโหนดและ PLC จริง: รัน </w:t>
+      </w:r>
+      <w:r>
+        <w:rPr>
+          <w:rFonts w:ascii="Consolas" w:hAnsi="Consolas" w:cs="Consolas" w:eastAsia="Consolas"/>
+          <w:b w:val="0"/>
+          <w:i w:val="0"/>
+          <w:sz w:val="21"/>
+        </w:rPr>
+        <w:t>app/field_sim.py</w:t>
+      </w:r>
+      <w:r>
+        <w:rPr>
+          <w:rFonts w:ascii="TH Sarabun New" w:hAnsi="TH Sarabun New" w:cs="TH Sarabun New" w:eastAsia="TH Sarabun New"/>
+          <w:b w:val="0"/>
+          <w:i w:val="0"/>
+        </w:rPr>
+        <w:t xml:space="preserve"> บนโน้ตบุ๊กเล่นแทน (ดินแห้งลงเอง ปั๊มเดินแล้วดินชื้นขึ้น) หรือให้บอร์ดของอีกกลุ่มรัน </w:t>
+      </w:r>
+      <w:r>
+        <w:rPr>
+          <w:rFonts w:ascii="Consolas" w:hAnsi="Consolas" w:cs="Consolas" w:eastAsia="Consolas"/>
+          <w:b w:val="0"/>
+          <w:i w:val="0"/>
+          <w:sz w:val="21"/>
+        </w:rPr>
+        <w:t>sf2_07_field_station.py</w:t>
+      </w:r>
+      <w:r>
+        <w:rPr>
+          <w:rFonts w:ascii="TH Sarabun New" w:hAnsi="TH Sarabun New" w:cs="TH Sarabun New" w:eastAsia="TH Sarabun New"/>
+          <w:b w:val="0"/>
+          <w:i w:val="0"/>
+        </w:rPr>
+        <w:t xml:space="preserve"> เป็นแปลง (VR1 = ดิน, VR4 = ถัง, ไฟสีฟ้า = รีเลย์) · ตั้ง </w:t>
+      </w:r>
+      <w:r>
+        <w:rPr>
+          <w:rFonts w:ascii="Consolas" w:hAnsi="Consolas" w:cs="Consolas" w:eastAsia="Consolas"/>
+          <w:b w:val="0"/>
+          <w:i w:val="0"/>
+          <w:sz w:val="21"/>
+        </w:rPr>
+        <w:t>TEAM</w:t>
+      </w:r>
+      <w:r>
+        <w:rPr>
+          <w:rFonts w:ascii="TH Sarabun New" w:hAnsi="TH Sarabun New" w:cs="TH Sarabun New" w:eastAsia="TH Sarabun New"/>
+          <w:b w:val="0"/>
+          <w:i w:val="0"/>
+        </w:rPr>
+        <w:t xml:space="preserve"> เดียวกันทุกตัว · หัวข้อและ JSON ทั้งหมดอยู่ใน </w:t>
+      </w:r>
+      <w:r>
+        <w:rPr>
+          <w:rFonts w:ascii="Consolas" w:hAnsi="Consolas" w:cs="Consolas" w:eastAsia="Consolas"/>
+          <w:b w:val="0"/>
+          <w:i w:val="0"/>
+          <w:sz w:val="21"/>
+        </w:rPr>
+        <w:t>app/MQTT_CONTRACT_th.md</w:t>
+      </w:r>
+      <w:r>
+        <w:rPr>
+          <w:rFonts w:ascii="TH Sarabun New" w:hAnsi="TH Sarabun New" w:cs="TH Sarabun New" w:eastAsia="TH Sarabun New"/>
+          <w:b w:val="0"/>
+          <w:i w:val="0"/>
+        </w:rPr>
+        <w:t xml:space="preserve"> ข้อ 0 และ 3.5-3.8</w:t>
+      </w:r>
+    </w:p>
+    <w:p>
+      <w:pPr>
+        <w:pStyle w:val="ListBullet"/>
+        <w:spacing w:after="60"/>
+      </w:pPr>
+      <w:r>
+        <w:rPr>
+          <w:rFonts w:ascii="TH Sarabun New" w:hAnsi="TH Sarabun New" w:cs="TH Sarabun New" w:eastAsia="TH Sarabun New"/>
+          <w:b w:val="0"/>
+          <w:i w:val="0"/>
+        </w:rPr>
+        <w:t>☐ Gateway ขึ้นค่าดินและถังจากแปลง · ☐ ดินต่ำกว่า 30 % แล้ว Gateway สั่งรดน้ำเอง ไฟ PLC บนจอติด มีเสียง · ☐ แตะสวิตช์ "ออโต้" ให้ปิด แล้วสั่งเองด้วยปุ่ม SW5</w:t>
+      </w:r>
+    </w:p>
+    <w:p>
+      <w:pPr>
+        <w:pStyle w:val="ListBullet"/>
+        <w:spacing w:after="60"/>
+      </w:pPr>
+      <w:r>
+        <w:rPr>
+          <w:rFonts w:ascii="TH Sarabun New" w:hAnsi="TH Sarabun New" w:cs="TH Sarabun New" w:eastAsia="TH Sarabun New"/>
+          <w:b w:val="0"/>
+          <w:i w:val="0"/>
+        </w:rPr>
+        <w:t xml:space="preserve">☐ ปิด </w:t>
+      </w:r>
+      <w:r>
+        <w:rPr>
+          <w:rFonts w:ascii="Consolas" w:hAnsi="Consolas" w:cs="Consolas" w:eastAsia="Consolas"/>
+          <w:b w:val="0"/>
+          <w:i w:val="0"/>
+          <w:sz w:val="21"/>
+        </w:rPr>
+        <w:t>field_sim.py</w:t>
+      </w:r>
+      <w:r>
+        <w:rPr>
+          <w:rFonts w:ascii="TH Sarabun New" w:hAnsi="TH Sarabun New" w:cs="TH Sarabun New" w:eastAsia="TH Sarabun New"/>
+          <w:b w:val="0"/>
+          <w:i w:val="0"/>
+        </w:rPr>
+        <w:t xml:space="preserve"> (หรือบอร์ดแปลง) แล้วจับเวลาว่า Gateway ขึ้น "PLC หลุด!" ภายใน ______ วินาที</w:t>
+      </w:r>
+    </w:p>
+    <w:tbl>
+      <w:tblPr>
+        <w:tblW w:type="auto" w:w="0"/>
+        <w:jc w:val="center"/>
+        <w:tblLook w:firstColumn="1" w:firstRow="1" w:lastColumn="0" w:lastRow="0" w:noHBand="0" w:noVBand="1" w:val="04A0"/>
+        <w:tblW w:type="pct" w:w="5000"/>
+        <w:tblBorders>
+          <w:top w:val="single" w:sz="4" w:space="0" w:color="C7D2E4"/>
+          <w:left w:val="single" w:sz="4" w:space="0" w:color="C7D2E4"/>
+          <w:bottom w:val="single" w:sz="4" w:space="0" w:color="C7D2E4"/>
+          <w:right w:val="single" w:sz="4" w:space="0" w:color="C7D2E4"/>
+          <w:insideH w:val="single" w:sz="4" w:space="0" w:color="C7D2E4"/>
+          <w:insideV w:val="single" w:sz="4" w:space="0" w:color="C7D2E4"/>
+        </w:tblBorders>
+      </w:tblPr>
+      <w:tblGrid>
+        <w:gridCol w:w="2436"/>
+        <w:gridCol w:w="2436"/>
+        <w:gridCol w:w="2436"/>
+        <w:gridCol w:w="2436"/>
+      </w:tblGrid>
+      <w:tr>
+        <w:trPr>
+          <w:tblHeader w:val="true"/>
+        </w:trPr>
+        <w:tc>
+          <w:tcPr>
+            <w:tcW w:type="dxa" w:w="2436"/>
+            <w:tcMar>
+              <w:top w:w="40" w:type="dxa"/>
+              <w:bottom w:w="40" w:type="dxa"/>
+              <w:start w:w="90" w:type="dxa"/>
+              <w:end w:w="90" w:type="dxa"/>
+            </w:tcMar>
+            <w:shd w:val="clear" w:fill="1F3864"/>
+          </w:tcPr>
+          <w:p>
+            <w:pPr>
+              <w:spacing w:after="40" w:before="40" w:line="252" w:lineRule="auto"/>
+            </w:pPr>
+            <w:r>
+              <w:rPr>
+                <w:rFonts w:ascii="TH Sarabun New" w:hAnsi="TH Sarabun New" w:cs="TH Sarabun New" w:eastAsia="TH Sarabun New"/>
+                <w:b/>
+              </w:rPr>
+            </w:r>
+            <w:r>
+              <w:rPr>
+                <w:rFonts w:ascii="TH Sarabun New" w:hAnsi="TH Sarabun New" w:cs="TH Sarabun New" w:eastAsia="TH Sarabun New"/>
+                <w:b/>
+                <w:i w:val="0"/>
+                <w:color w:val="FFFFFF"/>
+              </w:rPr>
+              <w:t>ใครตัดสินใจ</w:t>
+            </w:r>
+          </w:p>
+        </w:tc>
+        <w:tc>
+          <w:tcPr>
+            <w:tcW w:type="dxa" w:w="2436"/>
+            <w:tcMar>
+              <w:top w:w="40" w:type="dxa"/>
+              <w:bottom w:w="40" w:type="dxa"/>
+              <w:start w:w="90" w:type="dxa"/>
+              <w:end w:w="90" w:type="dxa"/>
+            </w:tcMar>
+            <w:shd w:val="clear" w:fill="1F3864"/>
+          </w:tcPr>
+          <w:p>
+            <w:pPr>
+              <w:spacing w:after="40" w:before="40" w:line="252" w:lineRule="auto"/>
+            </w:pPr>
+            <w:r>
+              <w:rPr>
+                <w:rFonts w:ascii="TH Sarabun New" w:hAnsi="TH Sarabun New" w:cs="TH Sarabun New" w:eastAsia="TH Sarabun New"/>
+                <w:b/>
+              </w:rPr>
+            </w:r>
+            <w:r>
+              <w:rPr>
+                <w:rFonts w:ascii="TH Sarabun New" w:hAnsi="TH Sarabun New" w:cs="TH Sarabun New" w:eastAsia="TH Sarabun New"/>
+                <w:b/>
+                <w:i w:val="0"/>
+                <w:color w:val="FFFFFF"/>
+              </w:rPr>
+              <w:t>ใครสั่ง</w:t>
+            </w:r>
+          </w:p>
+        </w:tc>
+        <w:tc>
+          <w:tcPr>
+            <w:tcW w:type="dxa" w:w="2436"/>
+            <w:tcMar>
+              <w:top w:w="40" w:type="dxa"/>
+              <w:bottom w:w="40" w:type="dxa"/>
+              <w:start w:w="90" w:type="dxa"/>
+              <w:end w:w="90" w:type="dxa"/>
+            </w:tcMar>
+            <w:shd w:val="clear" w:fill="1F3864"/>
+          </w:tcPr>
+          <w:p>
+            <w:pPr>
+              <w:spacing w:after="40" w:before="40" w:line="252" w:lineRule="auto"/>
+            </w:pPr>
+            <w:r>
+              <w:rPr>
+                <w:rFonts w:ascii="TH Sarabun New" w:hAnsi="TH Sarabun New" w:cs="TH Sarabun New" w:eastAsia="TH Sarabun New"/>
+                <w:b/>
+              </w:rPr>
+            </w:r>
+            <w:r>
+              <w:rPr>
+                <w:rFonts w:ascii="TH Sarabun New" w:hAnsi="TH Sarabun New" w:cs="TH Sarabun New" w:eastAsia="TH Sarabun New"/>
+                <w:b/>
+                <w:i w:val="0"/>
+                <w:color w:val="FFFFFF"/>
+              </w:rPr>
+              <w:t>ใครยืนยันว่าปั๊มเดินจริง</w:t>
+            </w:r>
+          </w:p>
+        </w:tc>
+        <w:tc>
+          <w:tcPr>
+            <w:tcW w:type="dxa" w:w="2436"/>
+            <w:tcMar>
+              <w:top w:w="40" w:type="dxa"/>
+              <w:bottom w:w="40" w:type="dxa"/>
+              <w:start w:w="90" w:type="dxa"/>
+              <w:end w:w="90" w:type="dxa"/>
+            </w:tcMar>
+            <w:shd w:val="clear" w:fill="1F3864"/>
+          </w:tcPr>
+          <w:p>
+            <w:pPr>
+              <w:spacing w:after="40" w:before="40" w:line="252" w:lineRule="auto"/>
+            </w:pPr>
+            <w:r>
+              <w:rPr>
+                <w:rFonts w:ascii="TH Sarabun New" w:hAnsi="TH Sarabun New" w:cs="TH Sarabun New" w:eastAsia="TH Sarabun New"/>
+                <w:b/>
+              </w:rPr>
+            </w:r>
+            <w:r>
+              <w:rPr>
+                <w:rFonts w:ascii="TH Sarabun New" w:hAnsi="TH Sarabun New" w:cs="TH Sarabun New" w:eastAsia="TH Sarabun New"/>
+                <w:b/>
+                <w:i w:val="0"/>
+                <w:color w:val="FFFFFF"/>
+              </w:rPr>
+              <w:t>ถ้า Gateway สั่งเปิด 999 วินาที ใครตัดเหลือ 30</w:t>
+            </w:r>
+          </w:p>
+        </w:tc>
+      </w:tr>
+      <w:tr>
+        <w:trPr>
+          <w:cantSplit w:val="true"/>
+        </w:trPr>
+        <w:tc>
+          <w:tcPr>
+            <w:tcW w:type="dxa" w:w="2436"/>
+            <w:tcMar>
+              <w:top w:w="40" w:type="dxa"/>
+              <w:bottom w:w="40" w:type="dxa"/>
+              <w:start w:w="90" w:type="dxa"/>
+              <w:end w:w="90" w:type="dxa"/>
+            </w:tcMar>
+          </w:tcPr>
+          <w:p>
+            <w:pPr>
+              <w:spacing w:after="40" w:before="40" w:line="252" w:lineRule="auto"/>
+            </w:pPr>
+            <w:r>
+              <w:rPr>
+                <w:rFonts w:ascii="TH Sarabun New" w:hAnsi="TH Sarabun New" w:cs="TH Sarabun New" w:eastAsia="TH Sarabun New"/>
+              </w:rPr>
+            </w:r>
+          </w:p>
+        </w:tc>
+        <w:tc>
+          <w:tcPr>
+            <w:tcW w:type="dxa" w:w="2436"/>
+            <w:tcMar>
+              <w:top w:w="40" w:type="dxa"/>
+              <w:bottom w:w="40" w:type="dxa"/>
+              <w:start w:w="90" w:type="dxa"/>
+              <w:end w:w="90" w:type="dxa"/>
+            </w:tcMar>
+          </w:tcPr>
+          <w:p>
+            <w:pPr>
+              <w:spacing w:after="40" w:before="40" w:line="252" w:lineRule="auto"/>
+            </w:pPr>
+            <w:r>
+              <w:rPr>
+                <w:rFonts w:ascii="TH Sarabun New" w:hAnsi="TH Sarabun New" w:cs="TH Sarabun New" w:eastAsia="TH Sarabun New"/>
+              </w:rPr>
+            </w:r>
+          </w:p>
+        </w:tc>
+        <w:tc>
+          <w:tcPr>
+            <w:tcW w:type="dxa" w:w="2436"/>
+            <w:tcMar>
+              <w:top w:w="40" w:type="dxa"/>
+              <w:bottom w:w="40" w:type="dxa"/>
+              <w:start w:w="90" w:type="dxa"/>
+              <w:end w:w="90" w:type="dxa"/>
+            </w:tcMar>
+          </w:tcPr>
+          <w:p>
+            <w:pPr>
+              <w:spacing w:after="40" w:before="40" w:line="252" w:lineRule="auto"/>
+            </w:pPr>
+            <w:r>
+              <w:rPr>
+                <w:rFonts w:ascii="TH Sarabun New" w:hAnsi="TH Sarabun New" w:cs="TH Sarabun New" w:eastAsia="TH Sarabun New"/>
+              </w:rPr>
+            </w:r>
+          </w:p>
+        </w:tc>
+        <w:tc>
+          <w:tcPr>
+            <w:tcW w:type="dxa" w:w="2436"/>
+            <w:tcMar>
+              <w:top w:w="40" w:type="dxa"/>
+              <w:bottom w:w="40" w:type="dxa"/>
+              <w:start w:w="90" w:type="dxa"/>
+              <w:end w:w="90" w:type="dxa"/>
+            </w:tcMar>
+          </w:tcPr>
+          <w:p>
+            <w:pPr>
+              <w:spacing w:after="40" w:before="40" w:line="252" w:lineRule="auto"/>
+            </w:pPr>
+            <w:r>
+              <w:rPr>
+                <w:rFonts w:ascii="TH Sarabun New" w:hAnsi="TH Sarabun New" w:cs="TH Sarabun New" w:eastAsia="TH Sarabun New"/>
+              </w:rPr>
+            </w:r>
+          </w:p>
+        </w:tc>
+      </w:tr>
+    </w:tbl>
+    <w:p>
+      <w:pPr>
+        <w:spacing w:after="40"/>
+      </w:pPr>
+    </w:p>
+    <w:p>
+      <w:pPr>
         <w:pBdr>
           <w:bottom w:val="single" w:sz="6" w:space="1" w:color="9DB2D4"/>
         </w:pBdr>
@@ -9491,6 +10393,70 @@
       </w:r>
     </w:p>
     <w:p>
+      <w:pPr>
+        <w:pStyle w:val="ListBullet"/>
+        <w:spacing w:after="60"/>
+      </w:pPr>
+      <w:r>
+        <w:rPr>
+          <w:rFonts w:ascii="TH Sarabun New" w:hAnsi="TH Sarabun New" w:cs="TH Sarabun New" w:eastAsia="TH Sarabun New"/>
+          <w:b w:val="0"/>
+          <w:i w:val="0"/>
+        </w:rPr>
+        <w:t xml:space="preserve">☐ </w:t>
+      </w:r>
+      <w:r>
+        <w:rPr>
+          <w:rFonts w:ascii="TH Sarabun New" w:hAnsi="TH Sarabun New" w:cs="TH Sarabun New" w:eastAsia="TH Sarabun New"/>
+          <w:b/>
+          <w:i w:val="0"/>
+        </w:rPr>
+        <w:t>D</w:t>
+      </w:r>
+      <w:r>
+        <w:rPr>
+          <w:rFonts w:ascii="TH Sarabun New" w:hAnsi="TH Sarabun New" w:cs="TH Sarabun New" w:eastAsia="TH Sarabun New"/>
+          <w:b w:val="0"/>
+          <w:i w:val="0"/>
+        </w:rPr>
+        <w:t xml:space="preserve"> Smart IoT Gateway: บอร์ดรัน </w:t>
+      </w:r>
+      <w:r>
+        <w:rPr>
+          <w:rFonts w:ascii="Consolas" w:hAnsi="Consolas" w:cs="Consolas" w:eastAsia="Consolas"/>
+          <w:b w:val="0"/>
+          <w:i w:val="0"/>
+          <w:sz w:val="21"/>
+        </w:rPr>
+        <w:t>sf2_06_smart_gateway.py</w:t>
+      </w:r>
+      <w:r>
+        <w:rPr>
+          <w:rFonts w:ascii="TH Sarabun New" w:hAnsi="TH Sarabun New" w:cs="TH Sarabun New" w:eastAsia="TH Sarabun New"/>
+          <w:b w:val="0"/>
+          <w:i w:val="0"/>
+        </w:rPr>
+        <w:t xml:space="preserve"> โน้ตบุ๊กรัน </w:t>
+      </w:r>
+      <w:r>
+        <w:rPr>
+          <w:rFonts w:ascii="Consolas" w:hAnsi="Consolas" w:cs="Consolas" w:eastAsia="Consolas"/>
+          <w:b w:val="0"/>
+          <w:i w:val="0"/>
+          <w:sz w:val="21"/>
+        </w:rPr>
+        <w:t>app/field_sim.py</w:t>
+      </w:r>
+      <w:r>
+        <w:rPr>
+          <w:rFonts w:ascii="TH Sarabun New" w:hAnsi="TH Sarabun New" w:cs="TH Sarabun New" w:eastAsia="TH Sarabun New"/>
+          <w:b w:val="0"/>
+          <w:i w:val="0"/>
+        </w:rPr>
+        <w:t xml:space="preserve"> (TEAM เดียวกัน) แล้วดูบอร์ดสั่ง PLC รดน้ำเองเมื่อดินแห้ง (ดูข้อ 4.6)</w:t>
+      </w:r>
+    </w:p>
+    <w:p>
       <w:r>
         <w:rPr>
           <w:rFonts w:ascii="TH Sarabun New" w:hAnsi="TH Sarabun New" w:cs="TH Sarabun New" w:eastAsia="TH Sarabun New"/>
@@ -9867,7 +10833,7 @@
           <w:i/>
           <w:color w:val="5B616B"/>
         </w:rPr>
-        <w:t>| ใช้จอ LED 16x8 / SW4 / SW5 / เสียง ทำอะไรในโปรเจกต์ | |</w:t>
+        <w:t>| ใช้จอ LED 16x8 / SW5 / SW6 / เสียง ทำอะไรในโปรเจกต์ | |</w:t>
       </w:r>
       <w:r>
         <w:rPr>

</xml_diff>

<commit_message>
session2: groups set their own hotspot; no spinner on any screen
WIFI_SSID and WIFI_PASS in every board file are generic placeholders
now, so no group is told what to call its hotspot. The worksheet gains
a hotspot setup box before activity 1: a short English name with no
spaces, a password of eight or more characters, Maximize Compatibility
on iPhone or the 2.4 GHz band on Android, and never sharing a file that
holds the real password.

sf2_01, sf2_03 and sf2_05 drop their Spinner, which flickers on the
Dev Kit; the status line already says when the board is connecting.
</commit_message>
<xml_diff>
--- a/s2/sf-s2-th.docx
+++ b/s2/sf-s2-th.docx
@@ -2353,24 +2353,7 @@
           <w:b w:val="0"/>
           <w:i w:val="0"/>
         </w:rPr>
-        <w:t xml:space="preserve"> WiFi ที่ต้อง login ผ่านหน้าเว็บ (captive portal) บอร์ดกดไม่ได้ จะได้ IP แต่ออกเน็ตไม่ได้ · ให้กลุ่มตั้งชื่อวงเป็นอักษรอังกฤษสั้น ๆ เช่น </w:t>
-      </w:r>
-      <w:r>
-        <w:rPr>
-          <w:rFonts w:ascii="Consolas" w:hAnsi="Consolas" w:cs="Consolas" w:eastAsia="Consolas"/>
-          <w:b w:val="0"/>
-          <w:i w:val="0"/>
-          <w:sz w:val="21"/>
-        </w:rPr>
-        <w:t>bento-team05</w:t>
-      </w:r>
-      <w:r>
-        <w:rPr>
-          <w:rFonts w:ascii="TH Sarabun New" w:hAnsi="TH Sarabun New" w:cs="TH Sarabun New" w:eastAsia="TH Sarabun New"/>
-          <w:b w:val="0"/>
-          <w:i w:val="0"/>
-        </w:rPr>
-        <w:t xml:space="preserve"> รหัสอย่างน้อย 8 ตัว · iPhone เปิด "เพิ่มความเข้ากันได้สูงสุด (Maximize Compatibility)" · Android เลือก 2.4 GHz ถ้ามีให้เลือก · บอร์ดล็อกโหมด WPA2/WPA3 ต่อวงเปิดไม่ได้</w:t>
+        <w:t xml:space="preserve"> WiFi ที่ต้อง login ผ่านหน้าเว็บ (captive portal) บอร์ดกดไม่ได้ จะได้ IP แต่ออกเน็ตไม่ได้ · แต่ละกลุ่มตั้งชื่อและรหัส Hotspot เอง (ดูกล่อง "ตั้ง Hotspot" ก่อนกิจกรรม 1) · iPhone เปิด "เพิ่มความเข้ากันได้สูงสุด (Maximize Compatibility)" · Android เลือก 2.4 GHz ถ้ามีให้เลือก · บอร์ดล็อกโหมด WPA2/WPA3 ต่อวงเปิดไม่ได้</w:t>
       </w:r>
     </w:p>
     <w:p>
@@ -4632,6 +4615,246 @@
       <w:pPr>
         <w:spacing w:after="40"/>
       </w:pPr>
+    </w:p>
+    <w:p>
+      <w:pPr>
+        <w:pStyle w:val="Heading3"/>
+      </w:pPr>
+      <w:r>
+        <w:rPr>
+          <w:rFonts w:ascii="TH Sarabun New" w:hAnsi="TH Sarabun New" w:cs="TH Sarabun New" w:eastAsia="TH Sarabun New"/>
+          <w:b/>
+          <w:i w:val="0"/>
+          <w:color w:val="2E5496"/>
+        </w:rPr>
+        <w:t>ตั้ง Hotspot มือถือให้บอร์ด (ทำก่อนกิจกรรม 1)</w:t>
+      </w:r>
+    </w:p>
+    <w:p>
+      <w:pPr>
+        <w:pStyle w:val="ListNumber"/>
+        <w:spacing w:after="60"/>
+      </w:pPr>
+      <w:r>
+        <w:rPr>
+          <w:rFonts w:ascii="TH Sarabun New" w:hAnsi="TH Sarabun New" w:cs="TH Sarabun New" w:eastAsia="TH Sarabun New"/>
+          <w:b/>
+          <w:i w:val="0"/>
+        </w:rPr>
+        <w:t>ตั้งชื่อ Hotspot เอง</w:t>
+      </w:r>
+      <w:r>
+        <w:rPr>
+          <w:rFonts w:ascii="TH Sarabun New" w:hAnsi="TH Sarabun New" w:cs="TH Sarabun New" w:eastAsia="TH Sarabun New"/>
+          <w:b w:val="0"/>
+          <w:i w:val="0"/>
+        </w:rPr>
+        <w:t xml:space="preserve"> อักษรอังกฤษหรือตัวเลขสั้น ๆ </w:t>
+      </w:r>
+      <w:r>
+        <w:rPr>
+          <w:rFonts w:ascii="TH Sarabun New" w:hAnsi="TH Sarabun New" w:cs="TH Sarabun New" w:eastAsia="TH Sarabun New"/>
+          <w:b/>
+          <w:i w:val="0"/>
+        </w:rPr>
+        <w:t>ไม่มีเว้นวรรค ไม่มีภาษาไทย</w:t>
+      </w:r>
+      <w:r>
+        <w:rPr>
+          <w:rFonts w:ascii="TH Sarabun New" w:hAnsi="TH Sarabun New" w:cs="TH Sarabun New" w:eastAsia="TH Sarabun New"/>
+          <w:b w:val="0"/>
+          <w:i w:val="0"/>
+        </w:rPr>
+        <w:t xml:space="preserve"> · </w:t>
+      </w:r>
+      <w:r>
+        <w:rPr>
+          <w:rFonts w:ascii="TH Sarabun New" w:hAnsi="TH Sarabun New" w:cs="TH Sarabun New" w:eastAsia="TH Sarabun New"/>
+          <w:b/>
+          <w:i w:val="0"/>
+        </w:rPr>
+        <w:t>รหัสอย่างน้อย 8 ตัว</w:t>
+      </w:r>
+    </w:p>
+    <w:p>
+      <w:pPr>
+        <w:pStyle w:val="ListNumber"/>
+        <w:spacing w:after="60"/>
+      </w:pPr>
+      <w:r>
+        <w:rPr>
+          <w:rFonts w:ascii="TH Sarabun New" w:hAnsi="TH Sarabun New" w:cs="TH Sarabun New" w:eastAsia="TH Sarabun New"/>
+          <w:b/>
+          <w:i w:val="0"/>
+        </w:rPr>
+        <w:t>iPhone:</w:t>
+      </w:r>
+      <w:r>
+        <w:rPr>
+          <w:rFonts w:ascii="TH Sarabun New" w:hAnsi="TH Sarabun New" w:cs="TH Sarabun New" w:eastAsia="TH Sarabun New"/>
+          <w:b w:val="0"/>
+          <w:i w:val="0"/>
+        </w:rPr>
+        <w:t xml:space="preserve"> ตั้งค่า → Hotspot ส่วนบุคคล → เปิด </w:t>
+      </w:r>
+      <w:r>
+        <w:rPr>
+          <w:rFonts w:ascii="TH Sarabun New" w:hAnsi="TH Sarabun New" w:cs="TH Sarabun New" w:eastAsia="TH Sarabun New"/>
+          <w:b/>
+          <w:i w:val="0"/>
+        </w:rPr>
+        <w:t>"เพิ่มความเข้ากันได้สูงสุด (Maximize Compatibility)"</w:t>
+      </w:r>
+      <w:r>
+        <w:rPr>
+          <w:rFonts w:ascii="TH Sarabun New" w:hAnsi="TH Sarabun New" w:cs="TH Sarabun New" w:eastAsia="TH Sarabun New"/>
+          <w:b w:val="0"/>
+          <w:i w:val="0"/>
+        </w:rPr>
+        <w:t xml:space="preserve"> ให้เป็นคลื่น 2.4 GHz</w:t>
+      </w:r>
+    </w:p>
+    <w:p>
+      <w:r>
+        <w:rPr>
+          <w:rFonts w:ascii="TH Sarabun New" w:hAnsi="TH Sarabun New" w:cs="TH Sarabun New" w:eastAsia="TH Sarabun New"/>
+          <w:b/>
+          <w:i w:val="0"/>
+        </w:rPr>
+        <w:t>Android:</w:t>
+      </w:r>
+      <w:r>
+        <w:rPr>
+          <w:rFonts w:ascii="TH Sarabun New" w:hAnsi="TH Sarabun New" w:cs="TH Sarabun New" w:eastAsia="TH Sarabun New"/>
+          <w:b w:val="0"/>
+          <w:i w:val="0"/>
+        </w:rPr>
+        <w:t xml:space="preserve"> ตั้งค่า Hotspot → เลือกคลื่น </w:t>
+      </w:r>
+      <w:r>
+        <w:rPr>
+          <w:rFonts w:ascii="TH Sarabun New" w:hAnsi="TH Sarabun New" w:cs="TH Sarabun New" w:eastAsia="TH Sarabun New"/>
+          <w:b/>
+          <w:i w:val="0"/>
+        </w:rPr>
+        <w:t>2.4 GHz</w:t>
+      </w:r>
+      <w:r>
+        <w:rPr>
+          <w:rFonts w:ascii="TH Sarabun New" w:hAnsi="TH Sarabun New" w:cs="TH Sarabun New" w:eastAsia="TH Sarabun New"/>
+          <w:b w:val="0"/>
+          <w:i w:val="0"/>
+        </w:rPr>
+        <w:t xml:space="preserve"> (ถ้ามีให้เลือก) · ต้องตั้งรหัส บอร์ดต่อวงที่ไม่มีรหัสไม่ได้</w:t>
+      </w:r>
+    </w:p>
+    <w:p>
+      <w:pPr>
+        <w:pStyle w:val="ListNumber"/>
+        <w:spacing w:after="60"/>
+      </w:pPr>
+      <w:r>
+        <w:rPr>
+          <w:rFonts w:ascii="TH Sarabun New" w:hAnsi="TH Sarabun New" w:cs="TH Sarabun New" w:eastAsia="TH Sarabun New"/>
+          <w:b w:val="0"/>
+          <w:i w:val="0"/>
+        </w:rPr>
+        <w:t xml:space="preserve">พิมพ์ชื่อและรหัสลงบรรทัดบนสุดของไฟล์ แทนข้อความในเครื่องหมาย </w:t>
+      </w:r>
+      <w:r>
+        <w:rPr>
+          <w:rFonts w:ascii="Consolas" w:hAnsi="Consolas" w:cs="Consolas" w:eastAsia="Consolas"/>
+          <w:b w:val="0"/>
+          <w:i w:val="0"/>
+          <w:sz w:val="21"/>
+        </w:rPr>
+        <w:t>&lt; &gt;</w:t>
+      </w:r>
+      <w:r>
+        <w:rPr>
+          <w:rFonts w:ascii="TH Sarabun New" w:hAnsi="TH Sarabun New" w:cs="TH Sarabun New" w:eastAsia="TH Sarabun New"/>
+          <w:b w:val="0"/>
+          <w:i w:val="0"/>
+        </w:rPr>
+        <w:t>:</w:t>
+      </w:r>
+    </w:p>
+    <w:p>
+      <w:r>
+        <w:rPr>
+          <w:rFonts w:ascii="Consolas" w:hAnsi="Consolas" w:cs="Consolas" w:eastAsia="Consolas"/>
+          <w:b w:val="0"/>
+          <w:i w:val="0"/>
+          <w:sz w:val="21"/>
+        </w:rPr>
+        <w:t>WIFI_SSID = "&lt;ชื่อ Hotspot ของกลุ่ม&gt;"</w:t>
+      </w:r>
+      <w:r>
+        <w:rPr>
+          <w:rFonts w:ascii="TH Sarabun New" w:hAnsi="TH Sarabun New" w:cs="TH Sarabun New" w:eastAsia="TH Sarabun New"/>
+          <w:b w:val="0"/>
+          <w:i w:val="0"/>
+        </w:rPr>
+        <w:t xml:space="preserve"> · </w:t>
+      </w:r>
+      <w:r>
+        <w:rPr>
+          <w:rFonts w:ascii="Consolas" w:hAnsi="Consolas" w:cs="Consolas" w:eastAsia="Consolas"/>
+          <w:b w:val="0"/>
+          <w:i w:val="0"/>
+          <w:sz w:val="21"/>
+        </w:rPr>
+        <w:t>WIFI_PASS = "&lt;รหัส Hotspot ของกลุ่ม&gt;"</w:t>
+      </w:r>
+    </w:p>
+    <w:p>
+      <w:pPr>
+        <w:pStyle w:val="ListNumber"/>
+        <w:spacing w:after="60"/>
+      </w:pPr>
+      <w:r>
+        <w:rPr>
+          <w:rFonts w:ascii="TH Sarabun New" w:hAnsi="TH Sarabun New" w:cs="TH Sarabun New" w:eastAsia="TH Sarabun New"/>
+          <w:b/>
+          <w:i w:val="0"/>
+        </w:rPr>
+        <w:t>อย่าส่งต่อหรืออัปโหลดไฟล์ที่ใส่รหัสจริง</w:t>
+      </w:r>
+      <w:r>
+        <w:rPr>
+          <w:rFonts w:ascii="TH Sarabun New" w:hAnsi="TH Sarabun New" w:cs="TH Sarabun New" w:eastAsia="TH Sarabun New"/>
+          <w:b w:val="0"/>
+          <w:i w:val="0"/>
+        </w:rPr>
+        <w:t xml:space="preserve"> (แชตกลุ่ม GitHub ฯลฯ) ก่อนส่งงานให้แก้กลับเป็น </w:t>
+      </w:r>
+      <w:r>
+        <w:rPr>
+          <w:rFonts w:ascii="Consolas" w:hAnsi="Consolas" w:cs="Consolas" w:eastAsia="Consolas"/>
+          <w:b w:val="0"/>
+          <w:i w:val="0"/>
+          <w:sz w:val="21"/>
+        </w:rPr>
+        <w:t>&lt;...&gt;</w:t>
+      </w:r>
+      <w:r>
+        <w:rPr>
+          <w:rFonts w:ascii="TH Sarabun New" w:hAnsi="TH Sarabun New" w:cs="TH Sarabun New" w:eastAsia="TH Sarabun New"/>
+          <w:b w:val="0"/>
+          <w:i w:val="0"/>
+        </w:rPr>
+        <w:t xml:space="preserve"> เหมือนเดิม</w:t>
+      </w:r>
+    </w:p>
+    <w:p>
+      <w:r>
+        <w:rPr>
+          <w:rFonts w:ascii="TH Sarabun New" w:hAnsi="TH Sarabun New" w:cs="TH Sarabun New" w:eastAsia="TH Sarabun New"/>
+          <w:b w:val="0"/>
+          <w:i w:val="0"/>
+        </w:rPr>
+        <w:t>ชื่อ Hotspot ของกลุ่มเรา: ________________ (ไม่ต้องจดรหัส)</w:t>
+      </w:r>
     </w:p>
     <w:p>
       <w:pPr>

</xml_diff>

<commit_message>
session2: class dashboard and team reader live in this repository
The worksheet and two board files pointed at mqtt_dashboard.html and
my_first_reader.html on another site. Both pages now ship in s2/app/
and every link goes to this course's own Pages address.
</commit_message>
<xml_diff>
--- a/s2/sf-s2-th.docx
+++ b/s2/sf-s2-th.docx
@@ -2566,7 +2566,7 @@
           <w:b w:val="0"/>
           <w:i w:val="0"/>
         </w:rPr>
-        <w:t xml:space="preserve"> แล้วเปิดหน้ารวม MQTT &lt;https://advance-innovation-centre-aic.github.io/embedded-systems-for-aiot-developer/examples/web/mqtt_dashboard.html&gt; บนเน็ตมหาวิทยาลัย การ์ดขึ้น = ผ่าน · ไม่ขึ้น = ให้โน้ตบุ๊กเกาะ Hotspot เดียวกับบอร์ด</w:t>
+        <w:t xml:space="preserve"> แล้วเปิดหน้ารวม MQTT &lt;https://advance-innovation-centre-aic.github.io/aiot-development-for-smart-farm/s2/app/mqtt_dashboard.html&gt; บนเน็ตมหาวิทยาลัย การ์ดขึ้น = ผ่าน · ไม่ขึ้น = ให้โน้ตบุ๊กเกาะ Hotspot เดียวกับบอร์ด</w:t>
       </w:r>
     </w:p>
     <w:p>
@@ -2970,7 +2970,7 @@
           <w:i w:val="0"/>
           <w:sz w:val="21"/>
         </w:rPr>
-        <w:t>mqtt_dashboard.html</w:t>
+        <w:t>app/mqtt_dashboard.html</w:t>
       </w:r>
       <w:r>
         <w:rPr>
@@ -5546,7 +5546,7 @@
           <w:b w:val="0"/>
           <w:i w:val="0"/>
         </w:rPr>
-        <w:t xml:space="preserve"> · ☐ เปิด &lt;https://advance-innovation-centre-aic.github.io/embedded-systems-for-aiot-developer/examples/web/my_first_reader.html?team=team__&gt; บนมือถือ เห็นกล่องค่าของกลุ่ม</w:t>
+        <w:t xml:space="preserve"> · ☐ เปิด &lt;https://advance-innovation-centre-aic.github.io/aiot-development-for-smart-farm/s2/app/my_first_reader.html?team=team__&gt; บนมือถือ เห็นกล่องค่าของกลุ่ม</w:t>
       </w:r>
     </w:p>
     <w:p>
@@ -7310,7 +7310,7 @@
           <w:i w:val="0"/>
           <w:sz w:val="21"/>
         </w:rPr>
-        <w:t>my_first_reader.html</w:t>
+        <w:t>app/my_first_reader.html</w:t>
       </w:r>
       <w:r>
         <w:rPr>
@@ -7327,7 +7327,7 @@
           <w:i w:val="0"/>
           <w:sz w:val="21"/>
         </w:rPr>
-        <w:t>farm_web.html</w:t>
+        <w:t>app/farm_web.html</w:t>
       </w:r>
       <w:r>
         <w:rPr>
@@ -7344,7 +7344,7 @@
           <w:i w:val="0"/>
           <w:sz w:val="21"/>
         </w:rPr>
-        <w:t>mqtt_dashboard.html</w:t>
+        <w:t>app/mqtt_dashboard.html</w:t>
       </w:r>
     </w:p>
     <w:tbl>

</xml_diff>

<commit_message>
session2: public wording in comments, contract and worksheet
Comments and documents no longer name a faculty or university network
or imply how many groups a class has: team numbers are "the one the
instructor hands out, e.g. team05", the contract speaks of the group's
app, and the worksheet refers to the venue's network and firewall.
Only comments and text change; the code is the same.
</commit_message>
<xml_diff>
--- a/s2/sf-s2-th.docx
+++ b/s2/sf-s2-th.docx
@@ -2541,7 +2541,7 @@
           <w:b/>
           <w:i w:val="0"/>
         </w:rPr>
-        <w:t>ไฟร์วอลล์มหาวิทยาลัยสำหรับพอร์ต 1883 และ 8884 ยังไม่เคยทดสอบ</w:t>
+        <w:t>ไฟร์วอลล์ของสถานที่สำหรับพอร์ต 1883 และ 8884 ยังไม่เคยทดสอบ</w:t>
       </w:r>
       <w:r>
         <w:rPr>
@@ -2566,7 +2566,7 @@
           <w:b w:val="0"/>
           <w:i w:val="0"/>
         </w:rPr>
-        <w:t xml:space="preserve"> แล้วเปิดหน้ารวม MQTT &lt;https://advance-innovation-centre-aic.github.io/aiot-development-for-smart-farm/s2/app/mqtt_dashboard.html&gt; บนเน็ตมหาวิทยาลัย การ์ดขึ้น = ผ่าน · ไม่ขึ้น = ให้โน้ตบุ๊กเกาะ Hotspot เดียวกับบอร์ด</w:t>
+        <w:t xml:space="preserve"> แล้วเปิดหน้ารวม MQTT &lt;https://advance-innovation-centre-aic.github.io/aiot-development-for-smart-farm/s2/app/mqtt_dashboard.html&gt; บนเน็ตของสถานที่ การ์ดขึ้น = ผ่าน · ไม่ขึ้น = ให้โน้ตบุ๊กเกาะ Hotspot เดียวกับบอร์ด</w:t>
       </w:r>
     </w:p>
     <w:p>
@@ -2605,7 +2605,7 @@
           <w:b w:val="0"/>
           <w:i w:val="0"/>
         </w:rPr>
-        <w:t xml:space="preserve"> ถึง </w:t>
+        <w:t xml:space="preserve">, </w:t>
       </w:r>
       <w:r>
         <w:rPr>
@@ -2614,15 +2614,15 @@
           <w:i w:val="0"/>
           <w:sz w:val="21"/>
         </w:rPr>
-        <w:t>team20</w:t>
-      </w:r>
-      <w:r>
-        <w:rPr>
-          <w:rFonts w:ascii="TH Sarabun New" w:hAnsi="TH Sarabun New" w:cs="TH Sarabun New" w:eastAsia="TH Sarabun New"/>
-          <w:b w:val="0"/>
-          <w:i w:val="0"/>
-        </w:rPr>
-        <w:t xml:space="preserve"> ห้ามซ้ำ (บอร์ดผู้สอนใช้ </w:t>
+        <w:t>team02</w:t>
+      </w:r>
+      <w:r>
+        <w:rPr>
+          <w:rFonts w:ascii="TH Sarabun New" w:hAnsi="TH Sarabun New" w:cs="TH Sarabun New" w:eastAsia="TH Sarabun New"/>
+          <w:b w:val="0"/>
+          <w:i w:val="0"/>
+        </w:rPr>
+        <w:t xml:space="preserve">, … ห้ามซ้ำ (บอร์ดผู้สอนใช้ </w:t>
       </w:r>
       <w:r>
         <w:rPr>
@@ -2757,41 +2757,7 @@
           <w:b w:val="0"/>
           <w:i w:val="0"/>
         </w:rPr>
-        <w:t xml:space="preserve"> จะปนกัน ให้แจกเลข </w:t>
-      </w:r>
-      <w:r>
-        <w:rPr>
-          <w:rFonts w:ascii="Consolas" w:hAnsi="Consolas" w:cs="Consolas" w:eastAsia="Consolas"/>
-          <w:b w:val="0"/>
-          <w:i w:val="0"/>
-          <w:sz w:val="21"/>
-        </w:rPr>
-        <w:t>team21</w:t>
-      </w:r>
-      <w:r>
-        <w:rPr>
-          <w:rFonts w:ascii="TH Sarabun New" w:hAnsi="TH Sarabun New" w:cs="TH Sarabun New" w:eastAsia="TH Sarabun New"/>
-          <w:b w:val="0"/>
-          <w:i w:val="0"/>
-        </w:rPr>
-        <w:t>–</w:t>
-      </w:r>
-      <w:r>
-        <w:rPr>
-          <w:rFonts w:ascii="Consolas" w:hAnsi="Consolas" w:cs="Consolas" w:eastAsia="Consolas"/>
-          <w:b w:val="0"/>
-          <w:i w:val="0"/>
-          <w:sz w:val="21"/>
-        </w:rPr>
-        <w:t>team40</w:t>
-      </w:r>
-      <w:r>
-        <w:rPr>
-          <w:rFonts w:ascii="TH Sarabun New" w:hAnsi="TH Sarabun New" w:cs="TH Sarabun New" w:eastAsia="TH Sarabun New"/>
-          <w:b w:val="0"/>
-          <w:i w:val="0"/>
-        </w:rPr>
-        <w:t xml:space="preserve"> แทน</w:t>
+        <w:t xml:space="preserve"> จะปนกัน ให้แจกเลขกลุ่มชุดที่ไม่ชนกับคลาสนั้นแทน</w:t>
       </w:r>
     </w:p>
     <w:p>

</xml_diff>

<commit_message>
session2: speaker level 40 % on firmware 2.4.2, kept safe on older boards
Every S2 board file and practise file sets SPEAKER = 40 in its settings
and, as the first lines of main(), calls ui.volume(SPEAKER) only when
the firmware has it, so boards still on 2.4.1 run unchanged. VOLUME
stays 25 for each beep(). The worksheet and the code-sections slide say
what the two numbers do, and the files ask for the latest firmware
instead of naming 2.4.1.

On the board, the beep() version already imports: sf2_06 and sf2_07
three out of three, sf2_02, 03, 04, 05 and the sf2_03 practise solution
once each. The SPEAKER lines passed the emulator run for all seven files;
the board check of this exact version is next.
</commit_message>
<xml_diff>
--- a/s2/sf-s2-th.docx
+++ b/s2/sf-s2-th.docx
@@ -103,7 +103,7 @@
           <w:b w:val="0"/>
           <w:i w:val="0"/>
         </w:rPr>
-        <w:t xml:space="preserve"> 2 คน · บอร์ด TESAIoT Dev Kit 1 ตัว (firmware 2.4.1) · โน้ตบุ๊กอย่างน้อย 1 เครื่อง</w:t>
+        <w:t xml:space="preserve"> 2 คน · บอร์ด TESAIoT Dev Kit 1 ตัว (firmware เวอร์ชันล่าสุด) · โน้ตบุ๊กอย่างน้อย 1 เครื่อง</w:t>
       </w:r>
     </w:p>
     <w:p>
@@ -552,7 +552,64 @@
           <w:i/>
           <w:color w:val="5B616B"/>
         </w:rPr>
-        <w:t xml:space="preserve"> บอกคนรับทุกครั้ง) · ปุ่ม SW5 / SW6 · ลำโพงดังเฉพาะตอนมีเหตุการณ์</w:t>
+        <w:t xml:space="preserve"> บอกคนรับทุกครั้ง) · ปุ่ม SW5 / SW6 · ลำโพงดังเฉพาะตอนมีเหตุการณ์ (ความดังตั้งในส่วน 1: </w:t>
+      </w:r>
+      <w:r>
+        <w:rPr>
+          <w:rFonts w:ascii="Consolas" w:hAnsi="Consolas" w:cs="Consolas" w:eastAsia="Consolas"/>
+          <w:b w:val="0"/>
+          <w:i/>
+          <w:color w:val="5B616B"/>
+          <w:sz w:val="21"/>
+        </w:rPr>
+        <w:t>SPEAKER</w:t>
+      </w:r>
+      <w:r>
+        <w:rPr>
+          <w:rFonts w:ascii="TH Sarabun New" w:hAnsi="TH Sarabun New" w:cs="TH Sarabun New" w:eastAsia="TH Sarabun New"/>
+          <w:b w:val="0"/>
+          <w:i/>
+          <w:color w:val="5B616B"/>
+        </w:rPr>
+        <w:t xml:space="preserve"> = ความดังลำโพงรวม 40 % บน firmware 2.4.2 ขึ้นไป · </w:t>
+      </w:r>
+      <w:r>
+        <w:rPr>
+          <w:rFonts w:ascii="Consolas" w:hAnsi="Consolas" w:cs="Consolas" w:eastAsia="Consolas"/>
+          <w:b w:val="0"/>
+          <w:i/>
+          <w:color w:val="5B616B"/>
+          <w:sz w:val="21"/>
+        </w:rPr>
+        <w:t>VOLUME</w:t>
+      </w:r>
+      <w:r>
+        <w:rPr>
+          <w:rFonts w:ascii="TH Sarabun New" w:hAnsi="TH Sarabun New" w:cs="TH Sarabun New" w:eastAsia="TH Sarabun New"/>
+          <w:b w:val="0"/>
+          <w:i/>
+          <w:color w:val="5B616B"/>
+        </w:rPr>
+        <w:t xml:space="preserve"> = ความดังของแต่ละเสียง </w:t>
+      </w:r>
+      <w:r>
+        <w:rPr>
+          <w:rFonts w:ascii="Consolas" w:hAnsi="Consolas" w:cs="Consolas" w:eastAsia="Consolas"/>
+          <w:b w:val="0"/>
+          <w:i/>
+          <w:color w:val="5B616B"/>
+          <w:sz w:val="21"/>
+        </w:rPr>
+        <w:t>beep()</w:t>
+      </w:r>
+      <w:r>
+        <w:rPr>
+          <w:rFonts w:ascii="TH Sarabun New" w:hAnsi="TH Sarabun New" w:cs="TH Sarabun New" w:eastAsia="TH Sarabun New"/>
+          <w:b w:val="0"/>
+          <w:i/>
+          <w:color w:val="5B616B"/>
+        </w:rPr>
+        <w:t>)</w:t>
       </w:r>
       <w:r>
         <w:rPr>

</xml_diff>

<commit_message>
docs: the BENTO Emulator reaches the public broker for real; slides, contract, worksheet and file headers no longer say its MQTT is simulated
Since BENTO IDE be9bd56 (2026-09-25) the Emulator's mqtt module connects to broker.hivemq.com (and test.mosquitto.org,
broker.emqx.io) over MQTT-over-WebSocket, appends -emu to the client id, keeps the board's one-slot inbox, and only
falls back to a simulated broker when the broker does not answer within about 5 s (it says so on the console). The
course still said 'No TCP leaves the browser' and that apps cannot see or command an Emulator board, which sent
classes to the wrong conclusion. Captions that describe how a screenshot was made (messages fed into the simulated
broker at capture time) keep saying so; the grading rule that MQTT evidence comes from the real board is unchanged.
</commit_message>
<xml_diff>
--- a/s2/sf-s2-th.docx
+++ b/s2/sf-s2-th.docx
@@ -3216,7 +3216,7 @@
           <w:rFonts w:ascii="TH Sarabun New" w:hAnsi="TH Sarabun New" w:eastAsia="TH Sarabun New"/>
           <w:sz w:val="30"/>
         </w:rPr>
-        <w:t xml:space="preserve">หมายเหตุ: BENTO Emulator ใช้ MQTT จำลองในเบราว์เซอร์ จึงไม่ใช่ตัวแทนสำหรับทดสอบว่า  หรือ </w:t>
+        <w:t xml:space="preserve">หมายเหตุ: BENTO Emulator ต่อ broker.hivemq.com จริงผ่าน WebSocket จึงใช้ทดสอบได้ว่า  หรือ </w:t>
       </w:r>
       <w:hyperlink r:id="rId14">
         <w:r>
@@ -3234,7 +3234,7 @@
           <w:rFonts w:ascii="TH Sarabun New" w:hAnsi="TH Sarabun New" w:eastAsia="TH Sarabun New"/>
           <w:sz w:val="30"/>
         </w:rPr>
-        <w:t xml:space="preserve"> รับข้อความจาก broker จริงได้</w:t>
+        <w:t xml:space="preserve"> รับข้อความจาก broker จริงได้ (ถ้า Emulator ต่อ broker ไม่ได้ใน 5 วิ จะใช้ broker จำลองแทนและบอกที่คอนโซล)</w:t>
       </w:r>
     </w:p>
     <w:p>

</xml_diff>